<commit_message>
docs(report): update Mini Project Report AIP (DOCX and PDF)
</commit_message>
<xml_diff>
--- a/Report/Mini Project Report AIP.docx
+++ b/Report/Mini Project Report AIP.docx
@@ -263,20 +263,7 @@
           <w:lang w:val="en-US"/>
           <w14:ligatures w14:val="none"/>
         </w:rPr>
-        <w:t>26CAH-6</w:t>
-      </w:r>
-      <w:r>
-        <w:rPr>
-          <w:rFonts w:ascii="Times New Roman" w:eastAsia="MS Mincho" w:hAnsi="Times New Roman" w:cs="Times New Roman"/>
-          <w:b/>
-          <w:color w:val="000000" w:themeColor="text1"/>
-          <w:kern w:val="0"/>
-          <w:sz w:val="32"/>
-          <w:szCs w:val="32"/>
-          <w:lang w:val="en-US"/>
-          <w14:ligatures w14:val="none"/>
-        </w:rPr>
-        <w:t>14</w:t>
+        <w:t>26CAH-614</w:t>
       </w:r>
       <w:r>
         <w:rPr>
@@ -542,8 +529,24 @@
           <w14:ligatures w14:val="none"/>
         </w:rPr>
         <w:tab/>
-      </w:r>
-      <w:r>
+        <w:t xml:space="preserve">Ms. </w:t>
+      </w:r>
+      <w:r>
+        <w:rPr>
+          <w:rFonts w:ascii="Times New Roman" w:eastAsia="MS Mincho" w:hAnsi="Times New Roman" w:cs="Times New Roman"/>
+          <w:color w:val="000000" w:themeColor="text1"/>
+          <w:kern w:val="0"/>
+          <w:sz w:val="28"/>
+          <w:szCs w:val="28"/>
+          <w14:ligatures w14:val="none"/>
+        </w:rPr>
+        <w:t>Tanisha</w:t>
+      </w:r>
+    </w:p>
+    <w:p>
+      <w:pPr>
+        <w:spacing w:after="100" w:line="276" w:lineRule="auto"/>
+        <w:ind w:firstLine="720"/>
         <w:rPr>
           <w:rFonts w:ascii="Times New Roman" w:eastAsia="MS Mincho" w:hAnsi="Times New Roman" w:cs="Times New Roman"/>
           <w:color w:val="000000" w:themeColor="text1"/>
@@ -553,24 +556,8 @@
           <w:lang w:val="en-US"/>
           <w14:ligatures w14:val="none"/>
         </w:rPr>
-        <w:t xml:space="preserve">Ms. </w:t>
-      </w:r>
-      <w:r>
-        <w:rPr>
-          <w:rFonts w:ascii="Times New Roman" w:eastAsia="MS Mincho" w:hAnsi="Times New Roman" w:cs="Times New Roman"/>
-          <w:color w:val="000000" w:themeColor="text1"/>
-          <w:kern w:val="0"/>
-          <w:sz w:val="28"/>
-          <w:szCs w:val="28"/>
-          <w14:ligatures w14:val="none"/>
-        </w:rPr>
-        <w:t>Tanisha</w:t>
-      </w:r>
-    </w:p>
-    <w:p>
-      <w:pPr>
-        <w:spacing w:after="100" w:line="276" w:lineRule="auto"/>
-        <w:ind w:firstLine="720"/>
+      </w:pPr>
+      <w:r>
         <w:rPr>
           <w:rFonts w:ascii="Times New Roman" w:eastAsia="MS Mincho" w:hAnsi="Times New Roman" w:cs="Times New Roman"/>
           <w:color w:val="000000" w:themeColor="text1"/>
@@ -580,7 +567,8 @@
           <w:lang w:val="en-US"/>
           <w14:ligatures w14:val="none"/>
         </w:rPr>
-      </w:pPr>
+        <w:t>26MCD10006</w:t>
+      </w:r>
       <w:r>
         <w:rPr>
           <w:rFonts w:ascii="Times New Roman" w:eastAsia="MS Mincho" w:hAnsi="Times New Roman" w:cs="Times New Roman"/>
@@ -591,7 +579,7 @@
           <w:lang w:val="en-US"/>
           <w14:ligatures w14:val="none"/>
         </w:rPr>
-        <w:t>26MCD10006</w:t>
+        <w:tab/>
       </w:r>
       <w:r>
         <w:rPr>
@@ -672,32 +660,9 @@
           <w:kern w:val="0"/>
           <w:sz w:val="28"/>
           <w:szCs w:val="28"/>
-          <w:lang w:val="en-US"/>
           <w14:ligatures w14:val="none"/>
         </w:rPr>
-        <w:tab/>
-      </w:r>
-      <w:r>
-        <w:rPr>
-          <w:rFonts w:ascii="Times New Roman" w:eastAsia="MS Mincho" w:hAnsi="Times New Roman" w:cs="Times New Roman"/>
-          <w:color w:val="000000" w:themeColor="text1"/>
-          <w:kern w:val="0"/>
-          <w:sz w:val="28"/>
-          <w:szCs w:val="28"/>
-          <w14:ligatures w14:val="none"/>
-        </w:rPr>
-        <w:t>E</w:t>
-      </w:r>
-      <w:r>
-        <w:rPr>
-          <w:rFonts w:ascii="Times New Roman" w:eastAsia="MS Mincho" w:hAnsi="Times New Roman" w:cs="Times New Roman"/>
-          <w:color w:val="000000" w:themeColor="text1"/>
-          <w:kern w:val="0"/>
-          <w:sz w:val="28"/>
-          <w:szCs w:val="28"/>
-          <w14:ligatures w14:val="none"/>
-        </w:rPr>
-        <w:t>20679</w:t>
+        <w:t>E20679</w:t>
       </w:r>
     </w:p>
     <w:p>
@@ -1053,31 +1018,7 @@
           <w:lang w:val="en-US"/>
           <w14:ligatures w14:val="none"/>
         </w:rPr>
-        <w:t xml:space="preserve"> </w:t>
-      </w:r>
-      <w:proofErr w:type="spellStart"/>
-      <w:r>
-        <w:rPr>
-          <w:rFonts w:ascii="Times New Roman" w:eastAsia="MS Mincho" w:hAnsi="Times New Roman" w:cs="Times New Roman"/>
-          <w:b/>
-          <w:color w:val="000000" w:themeColor="text1"/>
-          <w:kern w:val="0"/>
-          <w:lang w:val="en-US"/>
-          <w14:ligatures w14:val="none"/>
-        </w:rPr>
-        <w:t>Gharuan</w:t>
-      </w:r>
-      <w:proofErr w:type="spellEnd"/>
-      <w:r>
-        <w:rPr>
-          <w:rFonts w:ascii="Times New Roman" w:eastAsia="MS Mincho" w:hAnsi="Times New Roman" w:cs="Times New Roman"/>
-          <w:b/>
-          <w:color w:val="000000" w:themeColor="text1"/>
-          <w:kern w:val="0"/>
-          <w:lang w:val="en-US"/>
-          <w14:ligatures w14:val="none"/>
-        </w:rPr>
-        <w:t>, Mohali, Punjab, India-140413</w:t>
+        <w:t xml:space="preserve"> Gharuan, Mohali, Punjab, India-140413</w:t>
       </w:r>
     </w:p>
     <w:p>
@@ -6537,6 +6478,9 @@
         <w:jc w:val="center"/>
       </w:pPr>
       <w:r>
+        <w:rPr>
+          <w:noProof/>
+        </w:rPr>
         <w:drawing>
           <wp:inline distT="0" distB="0" distL="0" distR="0" wp14:anchorId="2FD941E0" wp14:editId="6E14863B">
             <wp:extent cx="4633454" cy="3088821"/>
@@ -11190,6 +11134,141 @@
     <w:p>
       <w:pPr>
         <w:pStyle w:val="Heading1"/>
+        <w:spacing w:before="0" w:after="0" w:line="240" w:lineRule="auto"/>
+        <w:jc w:val="center"/>
+        <w:rPr>
+          <w:rFonts w:ascii="Times New Roman" w:hAnsi="Times New Roman" w:cs="Times New Roman"/>
+          <w:b/>
+          <w:bCs/>
+          <w:color w:val="000000"/>
+          <w:sz w:val="32"/>
+          <w:szCs w:val="32"/>
+        </w:rPr>
+      </w:pPr>
+      <w:r>
+        <w:rPr>
+          <w:rFonts w:ascii="Times New Roman" w:hAnsi="Times New Roman" w:cs="Times New Roman"/>
+          <w:b/>
+          <w:bCs/>
+          <w:color w:val="000000"/>
+          <w:sz w:val="32"/>
+          <w:szCs w:val="32"/>
+        </w:rPr>
+        <w:lastRenderedPageBreak/>
+        <w:drawing>
+          <wp:inline distT="0" distB="0" distL="0" distR="0" wp14:anchorId="1721A739" wp14:editId="68ED8070">
+            <wp:extent cx="6645910" cy="3718560"/>
+            <wp:effectExtent l="0" t="0" r="2540" b="0"/>
+            <wp:docPr id="1974361284" name="Picture 1"/>
+            <wp:cNvGraphicFramePr>
+              <a:graphicFrameLocks xmlns:a="http://schemas.openxmlformats.org/drawingml/2006/main" noChangeAspect="1"/>
+            </wp:cNvGraphicFramePr>
+            <a:graphic xmlns:a="http://schemas.openxmlformats.org/drawingml/2006/main">
+              <a:graphicData uri="http://schemas.openxmlformats.org/drawingml/2006/picture">
+                <pic:pic xmlns:pic="http://schemas.openxmlformats.org/drawingml/2006/picture">
+                  <pic:nvPicPr>
+                    <pic:cNvPr id="1974361284" name=""/>
+                    <pic:cNvPicPr/>
+                  </pic:nvPicPr>
+                  <pic:blipFill>
+                    <a:blip r:embed="rId15"/>
+                    <a:stretch>
+                      <a:fillRect/>
+                    </a:stretch>
+                  </pic:blipFill>
+                  <pic:spPr>
+                    <a:xfrm>
+                      <a:off x="0" y="0"/>
+                      <a:ext cx="6645910" cy="3718560"/>
+                    </a:xfrm>
+                    <a:prstGeom prst="rect">
+                      <a:avLst/>
+                    </a:prstGeom>
+                  </pic:spPr>
+                </pic:pic>
+              </a:graphicData>
+            </a:graphic>
+          </wp:inline>
+        </w:drawing>
+      </w:r>
+    </w:p>
+    <w:p>
+      <w:pPr>
+        <w:spacing w:after="0" w:line="240" w:lineRule="auto"/>
+        <w:jc w:val="center"/>
+        <w:rPr>
+          <w:rFonts w:ascii="Times New Roman" w:hAnsi="Times New Roman" w:cs="Times New Roman"/>
+        </w:rPr>
+      </w:pPr>
+      <w:r>
+        <w:rPr>
+          <w:rFonts w:ascii="Times New Roman" w:hAnsi="Times New Roman" w:cs="Times New Roman"/>
+        </w:rPr>
+        <w:t xml:space="preserve">Figure 7. GitHub Repository of </w:t>
+      </w:r>
+      <w:proofErr w:type="spellStart"/>
+      <w:r>
+        <w:rPr>
+          <w:rFonts w:ascii="Times New Roman" w:hAnsi="Times New Roman" w:cs="Times New Roman"/>
+        </w:rPr>
+        <w:t>UniVentPortal</w:t>
+      </w:r>
+      <w:proofErr w:type="spellEnd"/>
+      <w:r>
+        <w:rPr>
+          <w:rFonts w:ascii="Times New Roman" w:hAnsi="Times New Roman" w:cs="Times New Roman"/>
+        </w:rPr>
+        <w:t xml:space="preserve"> – Public source code repository containing the project files, database schema, documentation, and project report.</w:t>
+      </w:r>
+    </w:p>
+    <w:p>
+      <w:pPr>
+        <w:spacing w:before="240" w:after="0" w:line="276" w:lineRule="auto"/>
+        <w:rPr>
+          <w:rFonts w:ascii="Times New Roman" w:hAnsi="Times New Roman" w:cs="Times New Roman"/>
+          <w:color w:val="000000" w:themeColor="text1"/>
+        </w:rPr>
+      </w:pPr>
+      <w:r>
+        <w:rPr>
+          <w:rFonts w:ascii="Times New Roman" w:hAnsi="Times New Roman" w:cs="Times New Roman"/>
+          <w:b/>
+          <w:bCs/>
+          <w:color w:val="000000" w:themeColor="text1"/>
+        </w:rPr>
+        <w:t>Repository Link:</w:t>
+      </w:r>
+      <w:r>
+        <w:rPr>
+          <w:rFonts w:ascii="Times New Roman" w:hAnsi="Times New Roman" w:cs="Times New Roman"/>
+          <w:color w:val="000000" w:themeColor="text1"/>
+        </w:rPr>
+        <w:t xml:space="preserve"> </w:t>
+      </w:r>
+      <w:hyperlink r:id="rId16" w:history="1">
+        <w:r>
+          <w:rPr>
+            <w:rStyle w:val="Hyperlink"/>
+            <w:rFonts w:ascii="Times New Roman" w:hAnsi="Times New Roman" w:cs="Times New Roman"/>
+            <w:color w:val="000000" w:themeColor="text1"/>
+          </w:rPr>
+          <w:t>https://github.com/arpitsaxenawork/campus-event-portal</w:t>
+        </w:r>
+      </w:hyperlink>
+    </w:p>
+    <w:p>
+      <w:pPr>
+        <w:spacing w:after="0" w:line="240" w:lineRule="auto"/>
+        <w:rPr>
+          <w:rFonts w:ascii="Times New Roman" w:hAnsi="Times New Roman" w:cs="Times New Roman"/>
+          <w:sz w:val="30"/>
+          <w:szCs w:val="30"/>
+        </w:rPr>
+      </w:pPr>
+    </w:p>
+    <w:p>
+      <w:pPr>
+        <w:pStyle w:val="Heading1"/>
         <w:spacing w:before="0"/>
         <w:rPr>
           <w:rFonts w:ascii="Times New Roman" w:hAnsi="Times New Roman" w:cs="Times New Roman"/>
@@ -11208,7 +11287,6 @@
           <w:sz w:val="32"/>
           <w:szCs w:val="32"/>
         </w:rPr>
-        <w:lastRenderedPageBreak/>
         <w:t>14. CONCLUSION</w:t>
       </w:r>
     </w:p>
@@ -11436,6 +11514,7 @@
           <w:sz w:val="32"/>
           <w:szCs w:val="32"/>
         </w:rPr>
+        <w:lastRenderedPageBreak/>
         <w:t>16. REFERENCES</w:t>
       </w:r>
     </w:p>
@@ -11529,7 +11608,7 @@
       </w:r>
     </w:p>
     <w:sectPr>
-      <w:headerReference w:type="default" r:id="rId15"/>
+      <w:headerReference w:type="default" r:id="rId17"/>
       <w:pgSz w:w="11906" w:h="16838"/>
       <w:pgMar w:top="720" w:right="720" w:bottom="720" w:left="720" w:header="720" w:footer="720" w:gutter="0"/>
       <w:pgBorders w:display="firstPage" w:offsetFrom="page">
@@ -13270,6 +13349,29 @@
       <w:rFonts w:ascii="Times New Roman" w:hAnsi="Times New Roman" w:cs="Times New Roman"/>
     </w:rPr>
   </w:style>
+  <w:style w:type="character" w:styleId="Hyperlink">
+    <w:name w:val="Hyperlink"/>
+    <w:basedOn w:val="DefaultParagraphFont"/>
+    <w:uiPriority w:val="99"/>
+    <w:unhideWhenUsed/>
+    <w:rsid w:val="00141CC0"/>
+    <w:rPr>
+      <w:color w:val="0563C1" w:themeColor="hyperlink"/>
+      <w:u w:val="single"/>
+    </w:rPr>
+  </w:style>
+  <w:style w:type="character" w:styleId="UnresolvedMention">
+    <w:name w:val="Unresolved Mention"/>
+    <w:basedOn w:val="DefaultParagraphFont"/>
+    <w:uiPriority w:val="99"/>
+    <w:semiHidden/>
+    <w:unhideWhenUsed/>
+    <w:rsid w:val="00141CC0"/>
+    <w:rPr>
+      <w:color w:val="605E5C"/>
+      <w:shd w:val="clear" w:color="auto" w:fill="E1DFDD"/>
+    </w:rPr>
+  </w:style>
 </w:styles>
 </file>
 

</xml_diff>